<commit_message>
Pujiang fee estimate: keep 800k total by reallocating to retained modules, drop sections 4 and 5
Co-Authored-By: Claude Sonnet 5.5 <noreply@anthropic.com>
Claude-Session: https://claude.ai/code/session_01DZcW8UzFAMq1wyGnVPG7By
</commit_message>
<xml_diff>
--- a/浦江/c-浦江网联试验室智能化提升项目（三期）费用估算.docx
+++ b/浦江/c-浦江网联试验室智能化提升项目（三期）费用估算.docx
@@ -994,7 +994,7 @@
                 <w:b w:val="0"/>
                 <w:sz w:val="21"/>
               </w:rPr>
-              <w:t>90,000</w:t>
+              <w:t>100,000</w:t>
             </w:r>
           </w:p>
         </w:tc>
@@ -1150,7 +1150,7 @@
                 <w:b w:val="0"/>
                 <w:sz w:val="21"/>
               </w:rPr>
-              <w:t>95,000</w:t>
+              <w:t>125,000</w:t>
             </w:r>
           </w:p>
         </w:tc>
@@ -1228,7 +1228,7 @@
                 <w:b w:val="0"/>
                 <w:sz w:val="21"/>
               </w:rPr>
-              <w:t>135,000</w:t>
+              <w:t>175,000</w:t>
             </w:r>
           </w:p>
         </w:tc>
@@ -1306,7 +1306,7 @@
                 <w:b w:val="0"/>
                 <w:sz w:val="21"/>
               </w:rPr>
-              <w:t>41,000</w:t>
+              <w:t>61,000</w:t>
             </w:r>
           </w:p>
         </w:tc>
@@ -1538,260 +1538,13 @@
                 <w:b/>
                 <w:sz w:val="21"/>
               </w:rPr>
-              <w:t>456,000</w:t>
+              <w:t>556,000</w:t>
             </w:r>
           </w:p>
         </w:tc>
       </w:tr>
     </w:tbl>
     <w:p/>
-    <w:p>
-      <w:pPr>
-        <w:spacing w:line="360" w:lineRule="auto" w:after="120"/>
-      </w:pPr>
-      <w:r>
-        <w:rPr>
-          <w:rFonts w:ascii="宋体" w:hAnsi="宋体" w:eastAsia="宋体"/>
-          <w:b/>
-          <w:sz w:val="28"/>
-        </w:rPr>
-        <w:t>四、费用汇总</w:t>
-      </w:r>
-    </w:p>
-    <w:tbl>
-      <w:tblPr>
-        <w:tblStyle w:val="TableGrid"/>
-        <w:tblW w:type="auto" w:w="0"/>
-        <w:jc w:val="center"/>
-        <w:tblLayout w:type="fixed"/>
-        <w:tblLook w:firstColumn="1" w:firstRow="1" w:lastColumn="0" w:lastRow="0" w:noHBand="0" w:noVBand="1" w:val="04A0"/>
-        <w:tblLayout w:type="fixed"/>
-      </w:tblPr>
-      <w:tblGrid>
-        <w:gridCol w:w="4535"/>
-        <w:gridCol w:w="2835"/>
-      </w:tblGrid>
-      <w:tr>
-        <w:tc>
-          <w:tcPr>
-            <w:tcW w:type="dxa" w:w="4535"/>
-            <w:shd w:val="clear" w:color="auto" w:fill="17365D"/>
-          </w:tcPr>
-          <w:p>
-            <w:pPr>
-              <w:jc w:val="center"/>
-            </w:pPr>
-            <w:r/>
-            <w:r>
-              <w:rPr>
-                <w:rFonts w:ascii="宋体" w:hAnsi="宋体" w:eastAsia="宋体"/>
-                <w:b/>
-                <w:color w:val="FFFFFF"/>
-                <w:sz w:val="21"/>
-              </w:rPr>
-              <w:t>项目</w:t>
-            </w:r>
-          </w:p>
-        </w:tc>
-        <w:tc>
-          <w:tcPr>
-            <w:tcW w:type="dxa" w:w="2835"/>
-            <w:shd w:val="clear" w:color="auto" w:fill="17365D"/>
-          </w:tcPr>
-          <w:p>
-            <w:pPr>
-              <w:jc w:val="center"/>
-            </w:pPr>
-            <w:r/>
-            <w:r>
-              <w:rPr>
-                <w:rFonts w:ascii="宋体" w:hAnsi="宋体" w:eastAsia="宋体"/>
-                <w:b/>
-                <w:color w:val="FFFFFF"/>
-                <w:sz w:val="21"/>
-              </w:rPr>
-              <w:t>金额（元）</w:t>
-            </w:r>
-          </w:p>
-        </w:tc>
-      </w:tr>
-      <w:tr>
-        <w:tc>
-          <w:tcPr>
-            <w:tcW w:type="dxa" w:w="4535"/>
-          </w:tcPr>
-          <w:p>
-            <w:pPr>
-              <w:jc w:val="left"/>
-            </w:pPr>
-            <w:r/>
-            <w:r>
-              <w:rPr>
-                <w:rFonts w:ascii="宋体" w:hAnsi="宋体" w:eastAsia="宋体"/>
-                <w:b w:val="0"/>
-                <w:sz w:val="21"/>
-              </w:rPr>
-              <w:t>硬件费用</w:t>
-            </w:r>
-          </w:p>
-        </w:tc>
-        <w:tc>
-          <w:tcPr>
-            <w:tcW w:type="dxa" w:w="2835"/>
-          </w:tcPr>
-          <w:p>
-            <w:pPr>
-              <w:jc w:val="right"/>
-            </w:pPr>
-            <w:r/>
-            <w:r>
-              <w:rPr>
-                <w:rFonts w:ascii="宋体" w:hAnsi="宋体" w:eastAsia="宋体"/>
-                <w:b w:val="0"/>
-                <w:sz w:val="21"/>
-              </w:rPr>
-              <w:t>244,000</w:t>
-            </w:r>
-          </w:p>
-        </w:tc>
-      </w:tr>
-      <w:tr>
-        <w:tc>
-          <w:tcPr>
-            <w:tcW w:type="dxa" w:w="4535"/>
-          </w:tcPr>
-          <w:p>
-            <w:pPr>
-              <w:jc w:val="left"/>
-            </w:pPr>
-            <w:r/>
-            <w:r>
-              <w:rPr>
-                <w:rFonts w:ascii="宋体" w:hAnsi="宋体" w:eastAsia="宋体"/>
-                <w:b w:val="0"/>
-                <w:sz w:val="21"/>
-              </w:rPr>
-              <w:t>软件费用</w:t>
-            </w:r>
-          </w:p>
-        </w:tc>
-        <w:tc>
-          <w:tcPr>
-            <w:tcW w:type="dxa" w:w="2835"/>
-          </w:tcPr>
-          <w:p>
-            <w:pPr>
-              <w:jc w:val="right"/>
-            </w:pPr>
-            <w:r/>
-            <w:r>
-              <w:rPr>
-                <w:rFonts w:ascii="宋体" w:hAnsi="宋体" w:eastAsia="宋体"/>
-                <w:b w:val="0"/>
-                <w:sz w:val="21"/>
-              </w:rPr>
-              <w:t>456,000</w:t>
-            </w:r>
-          </w:p>
-        </w:tc>
-      </w:tr>
-      <w:tr>
-        <w:tc>
-          <w:tcPr>
-            <w:tcW w:type="dxa" w:w="4535"/>
-          </w:tcPr>
-          <w:p>
-            <w:pPr>
-              <w:jc w:val="left"/>
-            </w:pPr>
-            <w:r/>
-            <w:r>
-              <w:rPr>
-                <w:rFonts w:ascii="宋体" w:hAnsi="宋体" w:eastAsia="宋体"/>
-                <w:b/>
-                <w:sz w:val="21"/>
-              </w:rPr>
-              <w:t>合计</w:t>
-            </w:r>
-          </w:p>
-        </w:tc>
-        <w:tc>
-          <w:tcPr>
-            <w:tcW w:type="dxa" w:w="2835"/>
-          </w:tcPr>
-          <w:p>
-            <w:pPr>
-              <w:jc w:val="right"/>
-            </w:pPr>
-            <w:r/>
-            <w:r>
-              <w:rPr>
-                <w:rFonts w:ascii="宋体" w:hAnsi="宋体" w:eastAsia="宋体"/>
-                <w:b/>
-                <w:sz w:val="21"/>
-              </w:rPr>
-              <w:t>700,000</w:t>
-            </w:r>
-          </w:p>
-        </w:tc>
-      </w:tr>
-    </w:tbl>
-    <w:p/>
-    <w:p>
-      <w:pPr>
-        <w:spacing w:line="360" w:lineRule="auto" w:after="120"/>
-      </w:pPr>
-      <w:r>
-        <w:rPr>
-          <w:rFonts w:ascii="宋体" w:hAnsi="宋体" w:eastAsia="宋体"/>
-          <w:b/>
-          <w:sz w:val="28"/>
-        </w:rPr>
-        <w:t>五、其他说明</w:t>
-      </w:r>
-    </w:p>
-    <w:p>
-      <w:pPr>
-        <w:spacing w:line="360" w:lineRule="auto" w:after="120"/>
-        <w:ind w:firstLine="420"/>
-      </w:pPr>
-      <w:r>
-        <w:rPr>
-          <w:rFonts w:ascii="宋体" w:hAnsi="宋体" w:eastAsia="宋体"/>
-          <w:b w:val="0"/>
-          <w:sz w:val="24"/>
-        </w:rPr>
-        <w:t>1. 大模型调用费用按实际调用量（token）计费，首年按6,000元估列，计入软件部分；单位无需另行采购算力设备。</w:t>
-      </w:r>
-    </w:p>
-    <w:p>
-      <w:pPr>
-        <w:spacing w:line="360" w:lineRule="auto" w:after="120"/>
-        <w:ind w:firstLine="420"/>
-      </w:pPr>
-      <w:r>
-        <w:rPr>
-          <w:rFonts w:ascii="宋体" w:hAnsi="宋体" w:eastAsia="宋体"/>
-          <w:b w:val="0"/>
-          <w:sz w:val="24"/>
-        </w:rPr>
-        <w:t>2. 委托进度短信通知如启用，短信费用按实际发生结算，不计入上述金额。</w:t>
-      </w:r>
-    </w:p>
-    <w:p>
-      <w:pPr>
-        <w:spacing w:line="360" w:lineRule="auto" w:after="120"/>
-        <w:ind w:firstLine="420"/>
-      </w:pPr>
-      <w:r>
-        <w:rPr>
-          <w:rFonts w:ascii="宋体" w:hAnsi="宋体" w:eastAsia="宋体"/>
-          <w:b w:val="0"/>
-          <w:sz w:val="24"/>
-        </w:rPr>
-        <w:t>3. 边缘采集网关数量以实际接入的试验设备数量为准，据实调整。</w:t>
-      </w:r>
-    </w:p>
     <w:sectPr>
       <w:pgSz w:w="11906" w:h="16838"/>
       <w:pgMar w:top="1440" w:right="1417" w:bottom="1440" w:left="1417" w:header="720" w:footer="720" w:gutter="0"/>

</xml_diff>